<commit_message>
Edits to front matter and score
</commit_message>
<xml_diff>
--- a/Front Matter/SCO Scores - Page Numbers.docx
+++ b/Front Matter/SCO Scores - Page Numbers.docx
@@ -124,7 +124,7 @@
           </w:tcPr>
           <w:p>
             <w:r>
-              <w:t>59</w:t>
+              <w:t>62</w:t>
             </w:r>
           </w:p>
         </w:tc>
@@ -134,7 +134,7 @@
           </w:tcPr>
           <w:p>
             <w:r>
-              <w:t>67</w:t>
+              <w:t>70</w:t>
             </w:r>
           </w:p>
         </w:tc>

</xml_diff>